<commit_message>
nmv 08 10 2026
</commit_message>
<xml_diff>
--- a/TS Jatai Ghanam Project/TS 4.1/TS 4.1 Jatai Malayalam Corrections.docx
+++ b/TS Jatai Ghanam Project/TS 4.1/TS 4.1 Jatai Malayalam Corrections.docx
@@ -120,20 +120,9 @@
           <w:bCs/>
           <w:sz w:val="32"/>
           <w:szCs w:val="32"/>
-          <w:highlight w:val="red"/>
           <w:u w:val="single"/>
         </w:rPr>
-        <w:t>??????</w:t>
-      </w:r>
-      <w:r>
-        <w:rPr>
-          <w:b/>
-          <w:bCs/>
-          <w:sz w:val="32"/>
-          <w:szCs w:val="32"/>
-          <w:u w:val="single"/>
-        </w:rPr>
-        <w:t>.</w:t>
+        <w:t>31st Oct 2026</w:t>
       </w:r>
     </w:p>
     <w:p>
@@ -3491,6 +3480,29 @@
           <w:u w:val="single"/>
         </w:rPr>
       </w:pPr>
+      <w:r>
+        <w:rPr>
+          <w:b/>
+          <w:bCs/>
+          <w:sz w:val="32"/>
+          <w:szCs w:val="32"/>
+          <w:u w:val="single"/>
+        </w:rPr>
+        <w:t>==========</w:t>
+      </w:r>
+    </w:p>
+    <w:p>
+      <w:pPr>
+        <w:spacing w:before="0" w:line="240" w:lineRule="auto"/>
+        <w:jc w:val="center"/>
+        <w:rPr>
+          <w:b/>
+          <w:bCs/>
+          <w:sz w:val="32"/>
+          <w:szCs w:val="32"/>
+          <w:u w:val="single"/>
+        </w:rPr>
+      </w:pPr>
     </w:p>
     <w:p>
       <w:pPr>
@@ -3525,6 +3537,7 @@
           <w:szCs w:val="32"/>
           <w:u w:val="single"/>
         </w:rPr>
+        <w:lastRenderedPageBreak/>
         <w:t xml:space="preserve">TS </w:t>
       </w:r>
       <w:r>
@@ -3738,7 +3751,6 @@
                 <w:sz w:val="32"/>
                 <w:szCs w:val="32"/>
               </w:rPr>
-              <w:lastRenderedPageBreak/>
               <w:t>As Printed</w:t>
             </w:r>
           </w:p>
@@ -14123,54 +14135,39 @@
               <w:adjustRightInd w:val="0"/>
               <w:spacing w:before="0" w:line="240" w:lineRule="auto"/>
               <w:rPr>
-                <w:rFonts w:ascii="BRH Malayalam Extra" w:hAnsi="BRH Malayalam Extra" w:cs="BRH Malayalam Extra"/>
-                <w:color w:val="000000"/>
-                <w:sz w:val="32"/>
-                <w:szCs w:val="32"/>
-              </w:rPr>
-            </w:pPr>
-            <w:r>
-              <w:rPr>
-                <w:rFonts w:ascii="BRH Malayalam Extra" w:hAnsi="BRH Malayalam Extra" w:cs="BRH Malayalam Extra"/>
-                <w:color w:val="000000"/>
-                <w:sz w:val="32"/>
-                <w:szCs w:val="32"/>
-              </w:rPr>
-              <w:t>Zûx „„</w:t>
-            </w:r>
-            <w:r>
-              <w:rPr>
-                <w:rFonts w:ascii="BRH Malayalam Extra" w:hAnsi="BRH Malayalam Extra" w:cs="BRH Malayalam Extra"/>
-                <w:color w:val="000000"/>
-                <w:sz w:val="32"/>
-                <w:szCs w:val="32"/>
-                <w:highlight w:val="yellow"/>
-              </w:rPr>
-              <w:t>Zûx˜</w:t>
-            </w:r>
-            <w:r>
-              <w:rPr>
-                <w:rFonts w:ascii="BRH Malayalam Extra" w:hAnsi="BRH Malayalam Extra" w:cs="BRH Malayalam Extra"/>
-                <w:color w:val="000000"/>
-                <w:sz w:val="32"/>
-                <w:szCs w:val="32"/>
-              </w:rPr>
-              <w:t xml:space="preserve"> Zûx | </w:t>
-            </w:r>
-          </w:p>
-          <w:p>
-            <w:pPr>
-              <w:widowControl w:val="0"/>
-              <w:autoSpaceDE w:val="0"/>
-              <w:autoSpaceDN w:val="0"/>
-              <w:adjustRightInd w:val="0"/>
-              <w:spacing w:before="0" w:line="240" w:lineRule="auto"/>
-              <w:rPr>
                 <w:rFonts w:cs="BRH Malayalam Extra"/>
                 <w:color w:val="FF0000"/>
                 <w:szCs w:val="40"/>
               </w:rPr>
             </w:pPr>
+            <w:r>
+              <w:rPr>
+                <w:rFonts w:ascii="BRH Malayalam Extra" w:hAnsi="BRH Malayalam Extra" w:cs="BRH Malayalam Extra"/>
+                <w:color w:val="000000"/>
+                <w:sz w:val="32"/>
+                <w:szCs w:val="32"/>
+              </w:rPr>
+              <w:t>Zûx „„</w:t>
+            </w:r>
+            <w:r>
+              <w:rPr>
+                <w:rFonts w:ascii="BRH Malayalam Extra" w:hAnsi="BRH Malayalam Extra" w:cs="BRH Malayalam Extra"/>
+                <w:color w:val="000000"/>
+                <w:sz w:val="32"/>
+                <w:szCs w:val="32"/>
+                <w:highlight w:val="yellow"/>
+              </w:rPr>
+              <w:t>Zûx˜</w:t>
+            </w:r>
+            <w:r>
+              <w:rPr>
+                <w:rFonts w:ascii="BRH Malayalam Extra" w:hAnsi="BRH Malayalam Extra" w:cs="BRH Malayalam Extra"/>
+                <w:color w:val="000000"/>
+                <w:sz w:val="32"/>
+                <w:szCs w:val="32"/>
+              </w:rPr>
+              <w:t xml:space="preserve"> Zûx | </w:t>
+            </w:r>
           </w:p>
         </w:tc>
         <w:tc>
@@ -14204,7 +14201,6 @@
                 <w:sz w:val="26"/>
                 <w:szCs w:val="32"/>
               </w:rPr>
-              <w:lastRenderedPageBreak/>
               <w:t>–</w:t>
             </w:r>
             <w:r>
@@ -14345,64 +14341,49 @@
               <w:adjustRightInd w:val="0"/>
               <w:spacing w:before="0" w:line="240" w:lineRule="auto"/>
               <w:rPr>
-                <w:rFonts w:ascii="BRH Malayalam Extra" w:hAnsi="BRH Malayalam Extra" w:cs="BRH Malayalam Extra"/>
-                <w:color w:val="000000"/>
-                <w:sz w:val="32"/>
-                <w:szCs w:val="32"/>
-              </w:rPr>
-            </w:pPr>
-            <w:r>
-              <w:rPr>
-                <w:rFonts w:ascii="BRH Malayalam Extra" w:hAnsi="BRH Malayalam Extra" w:cs="BRH Malayalam Extra"/>
-                <w:color w:val="000000"/>
-                <w:sz w:val="32"/>
-                <w:szCs w:val="32"/>
-              </w:rPr>
-              <w:t>Zûx „„</w:t>
-            </w:r>
-            <w:r>
-              <w:rPr>
-                <w:rFonts w:ascii="BRH Malayalam Extra" w:hAnsi="BRH Malayalam Extra" w:cs="BRH Malayalam Extra"/>
-                <w:color w:val="000000"/>
-                <w:sz w:val="32"/>
-                <w:szCs w:val="32"/>
-                <w:highlight w:val="green"/>
-              </w:rPr>
-              <w:t>Zûx</w:t>
-            </w:r>
-            <w:r>
-              <w:rPr>
-                <w:rFonts w:ascii="BRH Malayalam Extra" w:hAnsi="BRH Malayalam Extra" w:cs="BRH Malayalam Extra"/>
-                <w:color w:val="000000"/>
-                <w:sz w:val="26"/>
-                <w:szCs w:val="32"/>
-                <w:highlight w:val="green"/>
-              </w:rPr>
-              <w:t>–</w:t>
-            </w:r>
-            <w:r>
-              <w:rPr>
-                <w:rFonts w:ascii="BRH Malayalam Extra" w:hAnsi="BRH Malayalam Extra" w:cs="BRH Malayalam Extra"/>
-                <w:color w:val="000000"/>
-                <w:sz w:val="32"/>
-                <w:szCs w:val="32"/>
-              </w:rPr>
-              <w:t xml:space="preserve"> Zûx | </w:t>
-            </w:r>
-          </w:p>
-          <w:p>
-            <w:pPr>
-              <w:widowControl w:val="0"/>
-              <w:autoSpaceDE w:val="0"/>
-              <w:autoSpaceDN w:val="0"/>
-              <w:adjustRightInd w:val="0"/>
-              <w:spacing w:before="0" w:line="240" w:lineRule="auto"/>
-              <w:rPr>
                 <w:rFonts w:cs="BRH Malayalam Extra"/>
                 <w:color w:val="FF0000"/>
                 <w:szCs w:val="40"/>
               </w:rPr>
             </w:pPr>
+            <w:r>
+              <w:rPr>
+                <w:rFonts w:ascii="BRH Malayalam Extra" w:hAnsi="BRH Malayalam Extra" w:cs="BRH Malayalam Extra"/>
+                <w:color w:val="000000"/>
+                <w:sz w:val="32"/>
+                <w:szCs w:val="32"/>
+              </w:rPr>
+              <w:t>Zûx „„</w:t>
+            </w:r>
+            <w:r>
+              <w:rPr>
+                <w:rFonts w:ascii="BRH Malayalam Extra" w:hAnsi="BRH Malayalam Extra" w:cs="BRH Malayalam Extra"/>
+                <w:color w:val="000000"/>
+                <w:sz w:val="32"/>
+                <w:szCs w:val="32"/>
+                <w:highlight w:val="green"/>
+              </w:rPr>
+              <w:t>Zûx</w:t>
+            </w:r>
+            <w:r>
+              <w:rPr>
+                <w:rFonts w:ascii="BRH Malayalam Extra" w:hAnsi="BRH Malayalam Extra" w:cs="BRH Malayalam Extra"/>
+                <w:color w:val="000000"/>
+                <w:sz w:val="26"/>
+                <w:szCs w:val="32"/>
+                <w:highlight w:val="green"/>
+              </w:rPr>
+              <w:t>–</w:t>
+            </w:r>
+            <w:r>
+              <w:rPr>
+                <w:rFonts w:ascii="BRH Malayalam Extra" w:hAnsi="BRH Malayalam Extra" w:cs="BRH Malayalam Extra"/>
+                <w:color w:val="000000"/>
+                <w:sz w:val="32"/>
+                <w:szCs w:val="32"/>
+              </w:rPr>
+              <w:t xml:space="preserve"> Zûx | </w:t>
+            </w:r>
           </w:p>
         </w:tc>
       </w:tr>
@@ -18145,7 +18126,6 @@
                 <w:color w:val="000000"/>
                 <w:szCs w:val="32"/>
               </w:rPr>
-              <w:lastRenderedPageBreak/>
               <w:t>7</w:t>
             </w:r>
             <w:r>
@@ -22087,7 +22067,6 @@
                 <w:color w:val="000000"/>
                 <w:szCs w:val="32"/>
               </w:rPr>
-              <w:lastRenderedPageBreak/>
               <w:t>54</w:t>
             </w:r>
             <w:r>
@@ -22613,7 +22592,7 @@
       </w:tr>
       <w:tr>
         <w:trPr>
-          <w:trHeight w:val="1226"/>
+          <w:trHeight w:val="1125"/>
         </w:trPr>
         <w:tc>
           <w:tcPr>
@@ -22645,6 +22624,7 @@
                 <w:color w:val="000000"/>
                 <w:szCs w:val="32"/>
               </w:rPr>
+              <w:lastRenderedPageBreak/>
               <w:t>15</w:t>
             </w:r>
             <w:r>
@@ -23155,7 +23135,7 @@
       </w:tr>
       <w:tr>
         <w:trPr>
-          <w:trHeight w:val="1258"/>
+          <w:trHeight w:val="1029"/>
         </w:trPr>
         <w:tc>
           <w:tcPr>
@@ -26321,7 +26301,7 @@
       </w:tr>
       <w:tr>
         <w:trPr>
-          <w:trHeight w:val="771"/>
+          <w:trHeight w:val="1170"/>
         </w:trPr>
         <w:tc>
           <w:tcPr>
@@ -26341,12 +26321,248 @@
               <w:adjustRightInd w:val="0"/>
               <w:spacing w:before="0" w:line="240" w:lineRule="auto"/>
               <w:rPr>
-                <w:rFonts w:cs="BRH Malayalam Extra"/>
-                <w:color w:val="000000"/>
+                <w:rFonts w:ascii="BRH Malayalam Extra" w:hAnsi="BRH Malayalam Extra" w:cs="BRH Malayalam Extra"/>
+                <w:color w:val="000000"/>
+                <w:sz w:val="32"/>
                 <w:szCs w:val="32"/>
                 <w:lang w:val="en-IN"/>
               </w:rPr>
             </w:pPr>
+            <w:r>
+              <w:rPr>
+                <w:rFonts w:cs="BRH Malayalam Extra"/>
+                <w:color w:val="000000"/>
+                <w:szCs w:val="32"/>
+                <w:lang w:val="en-IN"/>
+              </w:rPr>
+              <w:t>20</w:t>
+            </w:r>
+            <w:r>
+              <w:rPr>
+                <w:rFonts w:ascii="BRH Malayalam Extra" w:hAnsi="BRH Malayalam Extra" w:cs="BRH Malayalam Extra"/>
+                <w:color w:val="000000"/>
+                <w:sz w:val="32"/>
+                <w:szCs w:val="32"/>
+                <w:lang w:val="en-IN"/>
+              </w:rPr>
+              <w:t>)</w:t>
+            </w:r>
+            <w:r>
+              <w:rPr>
+                <w:rFonts w:ascii="BRH Malayalam Extra" w:hAnsi="BRH Malayalam Extra" w:cs="BRH Malayalam Extra"/>
+                <w:color w:val="000000"/>
+                <w:sz w:val="32"/>
+                <w:szCs w:val="32"/>
+                <w:lang w:val="en-IN"/>
+              </w:rPr>
+              <w:tab/>
+            </w:r>
+            <w:r>
+              <w:rPr>
+                <w:rFonts w:cs="BRH Malayalam Extra"/>
+                <w:color w:val="000000"/>
+                <w:szCs w:val="32"/>
+                <w:lang w:val="en-IN"/>
+              </w:rPr>
+              <w:t>4</w:t>
+            </w:r>
+            <w:r>
+              <w:rPr>
+                <w:rFonts w:ascii="BRH Malayalam Extra" w:hAnsi="BRH Malayalam Extra" w:cs="BRH Malayalam Extra"/>
+                <w:color w:val="000000"/>
+                <w:sz w:val="32"/>
+                <w:szCs w:val="32"/>
+                <w:lang w:val="en-IN"/>
+              </w:rPr>
+              <w:t>.</w:t>
+            </w:r>
+            <w:r>
+              <w:rPr>
+                <w:rFonts w:cs="BRH Malayalam Extra"/>
+                <w:color w:val="000000"/>
+                <w:szCs w:val="32"/>
+                <w:lang w:val="en-IN"/>
+              </w:rPr>
+              <w:t>1</w:t>
+            </w:r>
+            <w:r>
+              <w:rPr>
+                <w:rFonts w:ascii="BRH Malayalam Extra" w:hAnsi="BRH Malayalam Extra" w:cs="BRH Malayalam Extra"/>
+                <w:color w:val="000000"/>
+                <w:sz w:val="32"/>
+                <w:szCs w:val="32"/>
+                <w:lang w:val="en-IN"/>
+              </w:rPr>
+              <w:t>.</w:t>
+            </w:r>
+            <w:r>
+              <w:rPr>
+                <w:rFonts w:cs="BRH Malayalam Extra"/>
+                <w:color w:val="000000"/>
+                <w:szCs w:val="32"/>
+                <w:lang w:val="en-IN"/>
+              </w:rPr>
+              <w:t>11</w:t>
+            </w:r>
+            <w:r>
+              <w:rPr>
+                <w:rFonts w:ascii="BRH Malayalam Extra" w:hAnsi="BRH Malayalam Extra" w:cs="BRH Malayalam Extra"/>
+                <w:color w:val="000000"/>
+                <w:sz w:val="32"/>
+                <w:szCs w:val="32"/>
+                <w:lang w:val="en-IN"/>
+              </w:rPr>
+              <w:t>.</w:t>
+            </w:r>
+            <w:r>
+              <w:rPr>
+                <w:rFonts w:cs="BRH Malayalam Extra"/>
+                <w:color w:val="000000"/>
+                <w:szCs w:val="32"/>
+                <w:lang w:val="en-IN"/>
+              </w:rPr>
+              <w:t>3</w:t>
+            </w:r>
+            <w:r>
+              <w:rPr>
+                <w:rFonts w:ascii="BRH Malayalam Extra" w:hAnsi="BRH Malayalam Extra" w:cs="BRH Malayalam Extra"/>
+                <w:color w:val="000000"/>
+                <w:sz w:val="32"/>
+                <w:szCs w:val="32"/>
+                <w:lang w:val="en-IN"/>
+              </w:rPr>
+              <w:t>(</w:t>
+            </w:r>
+            <w:r>
+              <w:rPr>
+                <w:rFonts w:cs="BRH Malayalam Extra"/>
+                <w:color w:val="000000"/>
+                <w:szCs w:val="32"/>
+                <w:lang w:val="en-IN"/>
+              </w:rPr>
+              <w:t>17</w:t>
+            </w:r>
+            <w:r>
+              <w:rPr>
+                <w:rFonts w:ascii="BRH Malayalam Extra" w:hAnsi="BRH Malayalam Extra" w:cs="BRH Malayalam Extra"/>
+                <w:color w:val="000000"/>
+                <w:sz w:val="32"/>
+                <w:szCs w:val="32"/>
+                <w:lang w:val="en-IN"/>
+              </w:rPr>
+              <w:t xml:space="preserve">)- </w:t>
+            </w:r>
+            <w:r>
+              <w:rPr>
+                <w:rFonts w:ascii="BRH Malayalam Extra" w:hAnsi="BRH Malayalam Extra" w:cs="BRH Malayalam Extra"/>
+                <w:color w:val="000000"/>
+                <w:sz w:val="32"/>
+                <w:szCs w:val="32"/>
+                <w:highlight w:val="yellow"/>
+                <w:lang w:val="en-IN"/>
+              </w:rPr>
+              <w:t>¥Z</w:t>
+            </w:r>
+            <w:r>
+              <w:rPr>
+                <w:rFonts w:ascii="BRH Malayalam Extra" w:hAnsi="BRH Malayalam Extra" w:cs="BRH Malayalam Extra"/>
+                <w:color w:val="000000"/>
+                <w:sz w:val="26"/>
+                <w:szCs w:val="32"/>
+                <w:lang w:val="en-IN"/>
+              </w:rPr>
+              <w:t>–</w:t>
+            </w:r>
+            <w:r>
+              <w:rPr>
+                <w:rFonts w:ascii="BRH Malayalam Extra" w:hAnsi="BRH Malayalam Extra" w:cs="BRH Malayalam Extra"/>
+                <w:color w:val="000000"/>
+                <w:sz w:val="32"/>
+                <w:szCs w:val="32"/>
+                <w:lang w:val="en-IN"/>
+              </w:rPr>
+              <w:t xml:space="preserve"> | A</w:t>
+            </w:r>
+            <w:r>
+              <w:rPr>
+                <w:rFonts w:ascii="BRH Malayalam Extra" w:hAnsi="BRH Malayalam Extra" w:cs="BRH Malayalam Extra"/>
+                <w:color w:val="000000"/>
+                <w:sz w:val="26"/>
+                <w:szCs w:val="32"/>
+                <w:lang w:val="en-IN"/>
+              </w:rPr>
+              <w:t>–</w:t>
+            </w:r>
+            <w:r>
+              <w:rPr>
+                <w:rFonts w:ascii="BRH Malayalam Extra" w:hAnsi="BRH Malayalam Extra" w:cs="BRH Malayalam Extra"/>
+                <w:color w:val="000000"/>
+                <w:sz w:val="32"/>
+                <w:szCs w:val="32"/>
+                <w:lang w:val="en-IN"/>
+              </w:rPr>
+              <w:t>p</w:t>
+            </w:r>
+            <w:r>
+              <w:rPr>
+                <w:rFonts w:ascii="BRH Malayalam Extra" w:hAnsi="BRH Malayalam Extra" w:cs="BRH Malayalam Extra"/>
+                <w:color w:val="000000"/>
+                <w:sz w:val="26"/>
+                <w:szCs w:val="32"/>
+                <w:lang w:val="en-IN"/>
+              </w:rPr>
+              <w:t>–</w:t>
+            </w:r>
+            <w:r>
+              <w:rPr>
+                <w:rFonts w:ascii="BRH Malayalam Extra" w:hAnsi="BRH Malayalam Extra" w:cs="BRH Malayalam Extra"/>
+                <w:color w:val="000000"/>
+                <w:sz w:val="32"/>
+                <w:szCs w:val="32"/>
+                <w:lang w:val="en-IN"/>
+              </w:rPr>
+              <w:t>ªÆ</w:t>
+            </w:r>
+            <w:r>
+              <w:rPr>
+                <w:rFonts w:ascii="BRH Malayalam Extra" w:hAnsi="BRH Malayalam Extra" w:cs="BRH Malayalam Extra"/>
+                <w:color w:val="000000"/>
+                <w:sz w:val="26"/>
+                <w:szCs w:val="32"/>
+                <w:lang w:val="en-IN"/>
+              </w:rPr>
+              <w:t>–</w:t>
+            </w:r>
+            <w:r>
+              <w:rPr>
+                <w:rFonts w:ascii="BRH Malayalam Extra" w:hAnsi="BRH Malayalam Extra" w:cs="BRH Malayalam Extra"/>
+                <w:color w:val="000000"/>
+                <w:sz w:val="32"/>
+                <w:szCs w:val="32"/>
+                <w:lang w:val="en-IN"/>
+              </w:rPr>
+              <w:t>Ç</w:t>
+            </w:r>
+            <w:r>
+              <w:rPr>
+                <w:rFonts w:ascii="BRH Malayalam Extra" w:hAnsi="BRH Malayalam Extra" w:cs="BRH Malayalam Extra"/>
+                <w:color w:val="000000"/>
+                <w:sz w:val="26"/>
+                <w:szCs w:val="32"/>
+                <w:lang w:val="en-IN"/>
+              </w:rPr>
+              <w:t>–</w:t>
+            </w:r>
+            <w:r>
+              <w:rPr>
+                <w:rFonts w:ascii="BRH Malayalam Extra" w:hAnsi="BRH Malayalam Extra" w:cs="BRH Malayalam Extra"/>
+                <w:color w:val="000000"/>
+                <w:sz w:val="32"/>
+                <w:szCs w:val="32"/>
+                <w:lang w:val="en-IN"/>
+              </w:rPr>
+              <w:t xml:space="preserve"> | </w:t>
+            </w:r>
           </w:p>
           <w:p>
             <w:pPr>
@@ -26357,612 +26573,300 @@
               <w:spacing w:before="0" w:line="240" w:lineRule="auto"/>
               <w:rPr>
                 <w:rFonts w:cs="BRH Malayalam Extra"/>
-                <w:color w:val="000000"/>
-                <w:szCs w:val="32"/>
-                <w:lang w:val="en-IN"/>
-              </w:rPr>
-            </w:pPr>
-          </w:p>
-          <w:p>
-            <w:pPr>
-              <w:widowControl w:val="0"/>
-              <w:autoSpaceDE w:val="0"/>
-              <w:autoSpaceDN w:val="0"/>
-              <w:adjustRightInd w:val="0"/>
-              <w:spacing w:before="0" w:line="240" w:lineRule="auto"/>
-              <w:rPr>
-                <w:rFonts w:cs="BRH Malayalam Extra"/>
-                <w:color w:val="000000"/>
-                <w:szCs w:val="32"/>
-                <w:lang w:val="en-IN"/>
-              </w:rPr>
-            </w:pPr>
-          </w:p>
-          <w:p>
-            <w:pPr>
-              <w:widowControl w:val="0"/>
-              <w:autoSpaceDE w:val="0"/>
-              <w:autoSpaceDN w:val="0"/>
-              <w:adjustRightInd w:val="0"/>
-              <w:spacing w:before="0" w:line="240" w:lineRule="auto"/>
-              <w:rPr>
-                <w:rFonts w:cs="BRH Malayalam Extra"/>
-                <w:color w:val="000000"/>
-                <w:szCs w:val="32"/>
-                <w:lang w:val="en-IN"/>
-              </w:rPr>
-            </w:pPr>
-          </w:p>
-          <w:p>
-            <w:pPr>
-              <w:widowControl w:val="0"/>
-              <w:autoSpaceDE w:val="0"/>
-              <w:autoSpaceDN w:val="0"/>
-              <w:adjustRightInd w:val="0"/>
-              <w:spacing w:before="0" w:line="240" w:lineRule="auto"/>
-              <w:rPr>
-                <w:rFonts w:ascii="BRH Malayalam Extra" w:hAnsi="BRH Malayalam Extra" w:cs="BRH Malayalam Extra"/>
-                <w:color w:val="000000"/>
-                <w:sz w:val="32"/>
-                <w:szCs w:val="32"/>
-                <w:lang w:val="en-IN"/>
-              </w:rPr>
-            </w:pPr>
-            <w:r>
-              <w:rPr>
-                <w:rFonts w:cs="BRH Malayalam Extra"/>
-                <w:color w:val="000000"/>
-                <w:szCs w:val="32"/>
-                <w:lang w:val="en-IN"/>
-              </w:rPr>
-              <w:t>20</w:t>
-            </w:r>
-            <w:r>
-              <w:rPr>
-                <w:rFonts w:ascii="BRH Malayalam Extra" w:hAnsi="BRH Malayalam Extra" w:cs="BRH Malayalam Extra"/>
-                <w:color w:val="000000"/>
-                <w:sz w:val="32"/>
-                <w:szCs w:val="32"/>
-                <w:lang w:val="en-IN"/>
-              </w:rPr>
-              <w:t>)</w:t>
-            </w:r>
-            <w:r>
-              <w:rPr>
-                <w:rFonts w:ascii="BRH Malayalam Extra" w:hAnsi="BRH Malayalam Extra" w:cs="BRH Malayalam Extra"/>
-                <w:color w:val="000000"/>
-                <w:sz w:val="32"/>
-                <w:szCs w:val="32"/>
-                <w:lang w:val="en-IN"/>
-              </w:rPr>
-              <w:tab/>
-            </w:r>
-            <w:r>
-              <w:rPr>
-                <w:rFonts w:cs="BRH Malayalam Extra"/>
-                <w:color w:val="000000"/>
-                <w:szCs w:val="32"/>
-                <w:lang w:val="en-IN"/>
-              </w:rPr>
-              <w:t>4</w:t>
-            </w:r>
-            <w:r>
-              <w:rPr>
-                <w:rFonts w:ascii="BRH Malayalam Extra" w:hAnsi="BRH Malayalam Extra" w:cs="BRH Malayalam Extra"/>
-                <w:color w:val="000000"/>
-                <w:sz w:val="32"/>
-                <w:szCs w:val="32"/>
-                <w:lang w:val="en-IN"/>
-              </w:rPr>
-              <w:t>.</w:t>
-            </w:r>
-            <w:r>
-              <w:rPr>
-                <w:rFonts w:cs="BRH Malayalam Extra"/>
-                <w:color w:val="000000"/>
-                <w:szCs w:val="32"/>
-                <w:lang w:val="en-IN"/>
-              </w:rPr>
-              <w:t>1</w:t>
-            </w:r>
-            <w:r>
-              <w:rPr>
-                <w:rFonts w:ascii="BRH Malayalam Extra" w:hAnsi="BRH Malayalam Extra" w:cs="BRH Malayalam Extra"/>
-                <w:color w:val="000000"/>
-                <w:sz w:val="32"/>
-                <w:szCs w:val="32"/>
-                <w:lang w:val="en-IN"/>
-              </w:rPr>
-              <w:t>.</w:t>
-            </w:r>
-            <w:r>
-              <w:rPr>
-                <w:rFonts w:cs="BRH Malayalam Extra"/>
-                <w:color w:val="000000"/>
-                <w:szCs w:val="32"/>
-                <w:lang w:val="en-IN"/>
-              </w:rPr>
-              <w:t>11</w:t>
-            </w:r>
-            <w:r>
-              <w:rPr>
-                <w:rFonts w:ascii="BRH Malayalam Extra" w:hAnsi="BRH Malayalam Extra" w:cs="BRH Malayalam Extra"/>
-                <w:color w:val="000000"/>
-                <w:sz w:val="32"/>
-                <w:szCs w:val="32"/>
-                <w:lang w:val="en-IN"/>
-              </w:rPr>
-              <w:t>.</w:t>
-            </w:r>
-            <w:r>
-              <w:rPr>
-                <w:rFonts w:cs="BRH Malayalam Extra"/>
-                <w:color w:val="000000"/>
-                <w:szCs w:val="32"/>
-                <w:lang w:val="en-IN"/>
-              </w:rPr>
-              <w:t>3</w:t>
-            </w:r>
-            <w:r>
-              <w:rPr>
-                <w:rFonts w:ascii="BRH Malayalam Extra" w:hAnsi="BRH Malayalam Extra" w:cs="BRH Malayalam Extra"/>
-                <w:color w:val="000000"/>
-                <w:sz w:val="32"/>
-                <w:szCs w:val="32"/>
-                <w:lang w:val="en-IN"/>
-              </w:rPr>
-              <w:t>(</w:t>
-            </w:r>
-            <w:r>
-              <w:rPr>
-                <w:rFonts w:cs="BRH Malayalam Extra"/>
-                <w:color w:val="000000"/>
-                <w:szCs w:val="32"/>
-                <w:lang w:val="en-IN"/>
-              </w:rPr>
-              <w:t>17</w:t>
-            </w:r>
-            <w:r>
-              <w:rPr>
-                <w:rFonts w:ascii="BRH Malayalam Extra" w:hAnsi="BRH Malayalam Extra" w:cs="BRH Malayalam Extra"/>
-                <w:color w:val="000000"/>
-                <w:sz w:val="32"/>
-                <w:szCs w:val="32"/>
-                <w:lang w:val="en-IN"/>
-              </w:rPr>
-              <w:t xml:space="preserve">)- </w:t>
-            </w:r>
-            <w:r>
-              <w:rPr>
-                <w:rFonts w:ascii="BRH Malayalam Extra" w:hAnsi="BRH Malayalam Extra" w:cs="BRH Malayalam Extra"/>
-                <w:color w:val="000000"/>
-                <w:sz w:val="32"/>
-                <w:szCs w:val="32"/>
-                <w:highlight w:val="yellow"/>
-                <w:lang w:val="en-IN"/>
-              </w:rPr>
-              <w:t>¥Z</w:t>
-            </w:r>
-            <w:r>
-              <w:rPr>
-                <w:rFonts w:ascii="BRH Malayalam Extra" w:hAnsi="BRH Malayalam Extra" w:cs="BRH Malayalam Extra"/>
-                <w:color w:val="000000"/>
-                <w:sz w:val="26"/>
-                <w:szCs w:val="32"/>
-                <w:lang w:val="en-IN"/>
-              </w:rPr>
-              <w:t>–</w:t>
-            </w:r>
-            <w:r>
-              <w:rPr>
-                <w:rFonts w:ascii="BRH Malayalam Extra" w:hAnsi="BRH Malayalam Extra" w:cs="BRH Malayalam Extra"/>
-                <w:color w:val="000000"/>
-                <w:sz w:val="32"/>
-                <w:szCs w:val="32"/>
-                <w:lang w:val="en-IN"/>
-              </w:rPr>
-              <w:t xml:space="preserve"> | A</w:t>
-            </w:r>
-            <w:r>
-              <w:rPr>
-                <w:rFonts w:ascii="BRH Malayalam Extra" w:hAnsi="BRH Malayalam Extra" w:cs="BRH Malayalam Extra"/>
-                <w:color w:val="000000"/>
-                <w:sz w:val="26"/>
-                <w:szCs w:val="32"/>
-                <w:lang w:val="en-IN"/>
-              </w:rPr>
-              <w:t>–</w:t>
-            </w:r>
-            <w:r>
-              <w:rPr>
-                <w:rFonts w:ascii="BRH Malayalam Extra" w:hAnsi="BRH Malayalam Extra" w:cs="BRH Malayalam Extra"/>
-                <w:color w:val="000000"/>
-                <w:sz w:val="32"/>
-                <w:szCs w:val="32"/>
-                <w:lang w:val="en-IN"/>
-              </w:rPr>
-              <w:t>p</w:t>
-            </w:r>
-            <w:r>
-              <w:rPr>
-                <w:rFonts w:ascii="BRH Malayalam Extra" w:hAnsi="BRH Malayalam Extra" w:cs="BRH Malayalam Extra"/>
-                <w:color w:val="000000"/>
-                <w:sz w:val="26"/>
-                <w:szCs w:val="32"/>
-                <w:lang w:val="en-IN"/>
-              </w:rPr>
-              <w:t>–</w:t>
-            </w:r>
-            <w:r>
-              <w:rPr>
-                <w:rFonts w:ascii="BRH Malayalam Extra" w:hAnsi="BRH Malayalam Extra" w:cs="BRH Malayalam Extra"/>
-                <w:color w:val="000000"/>
-                <w:sz w:val="32"/>
-                <w:szCs w:val="32"/>
-                <w:lang w:val="en-IN"/>
-              </w:rPr>
-              <w:t>ªÆ</w:t>
-            </w:r>
-            <w:r>
-              <w:rPr>
-                <w:rFonts w:ascii="BRH Malayalam Extra" w:hAnsi="BRH Malayalam Extra" w:cs="BRH Malayalam Extra"/>
-                <w:color w:val="000000"/>
-                <w:sz w:val="26"/>
-                <w:szCs w:val="32"/>
-                <w:lang w:val="en-IN"/>
-              </w:rPr>
-              <w:t>–</w:t>
-            </w:r>
-            <w:r>
-              <w:rPr>
-                <w:rFonts w:ascii="BRH Malayalam Extra" w:hAnsi="BRH Malayalam Extra" w:cs="BRH Malayalam Extra"/>
-                <w:color w:val="000000"/>
-                <w:sz w:val="32"/>
-                <w:szCs w:val="32"/>
-                <w:lang w:val="en-IN"/>
-              </w:rPr>
-              <w:t>Ç</w:t>
-            </w:r>
-            <w:r>
-              <w:rPr>
-                <w:rFonts w:ascii="BRH Malayalam Extra" w:hAnsi="BRH Malayalam Extra" w:cs="BRH Malayalam Extra"/>
-                <w:color w:val="000000"/>
-                <w:sz w:val="26"/>
-                <w:szCs w:val="32"/>
-                <w:lang w:val="en-IN"/>
-              </w:rPr>
-              <w:t>–</w:t>
-            </w:r>
-            <w:r>
-              <w:rPr>
-                <w:rFonts w:ascii="BRH Malayalam Extra" w:hAnsi="BRH Malayalam Extra" w:cs="BRH Malayalam Extra"/>
-                <w:color w:val="000000"/>
-                <w:sz w:val="32"/>
-                <w:szCs w:val="32"/>
-                <w:lang w:val="en-IN"/>
-              </w:rPr>
-              <w:t xml:space="preserve"> | </w:t>
-            </w:r>
-          </w:p>
-          <w:p>
-            <w:pPr>
-              <w:widowControl w:val="0"/>
-              <w:autoSpaceDE w:val="0"/>
-              <w:autoSpaceDN w:val="0"/>
-              <w:adjustRightInd w:val="0"/>
-              <w:spacing w:before="0" w:line="240" w:lineRule="auto"/>
-              <w:rPr>
-                <w:rFonts w:ascii="BRH Malayalam Extra" w:hAnsi="BRH Malayalam Extra" w:cs="BRH Malayalam Extra"/>
-                <w:color w:val="000000"/>
-                <w:sz w:val="32"/>
-                <w:szCs w:val="32"/>
-                <w:lang w:val="en-IN"/>
-              </w:rPr>
-            </w:pPr>
-            <w:r>
-              <w:rPr>
-                <w:rFonts w:ascii="BRH Malayalam Extra" w:hAnsi="BRH Malayalam Extra" w:cs="BRH Malayalam Extra"/>
-                <w:color w:val="000000"/>
-                <w:sz w:val="32"/>
-                <w:szCs w:val="32"/>
-                <w:highlight w:val="yellow"/>
-                <w:lang w:val="en-IN"/>
-              </w:rPr>
-              <w:t>¥Z</w:t>
-            </w:r>
-            <w:r>
-              <w:rPr>
-                <w:rFonts w:ascii="BRH Malayalam Extra" w:hAnsi="BRH Malayalam Extra" w:cs="BRH Malayalam Extra"/>
-                <w:color w:val="000000"/>
-                <w:sz w:val="26"/>
-                <w:szCs w:val="32"/>
-                <w:lang w:val="en-IN"/>
-              </w:rPr>
-              <w:t>–</w:t>
-            </w:r>
-            <w:r>
-              <w:rPr>
-                <w:rFonts w:ascii="BRH Malayalam Extra" w:hAnsi="BRH Malayalam Extra" w:cs="BRH Malayalam Extra"/>
-                <w:color w:val="000000"/>
-                <w:sz w:val="32"/>
-                <w:szCs w:val="32"/>
-                <w:lang w:val="en-IN"/>
-              </w:rPr>
-              <w:t xml:space="preserve"> </w:t>
-            </w:r>
-            <w:r>
-              <w:rPr>
-                <w:rFonts w:ascii="BRH Malayalam Extra" w:hAnsi="BRH Malayalam Extra" w:cs="BRH Malayalam Extra"/>
-                <w:color w:val="000000"/>
-                <w:sz w:val="32"/>
-                <w:szCs w:val="32"/>
-                <w:highlight w:val="yellow"/>
-                <w:lang w:val="en-IN"/>
-              </w:rPr>
-              <w:t>„p</w:t>
-            </w:r>
-            <w:r>
-              <w:rPr>
-                <w:rFonts w:ascii="BRH Malayalam Extra" w:hAnsi="BRH Malayalam Extra" w:cs="BRH Malayalam Extra"/>
-                <w:color w:val="000000"/>
-                <w:sz w:val="26"/>
-                <w:szCs w:val="32"/>
-                <w:highlight w:val="yellow"/>
-                <w:lang w:val="en-IN"/>
-              </w:rPr>
-              <w:t>–</w:t>
-            </w:r>
-            <w:r>
-              <w:rPr>
-                <w:rFonts w:ascii="BRH Malayalam Extra" w:hAnsi="BRH Malayalam Extra" w:cs="BRH Malayalam Extra"/>
-                <w:color w:val="000000"/>
-                <w:sz w:val="32"/>
-                <w:szCs w:val="32"/>
-                <w:highlight w:val="yellow"/>
-                <w:lang w:val="en-IN"/>
-              </w:rPr>
-              <w:t>ªÆ</w:t>
-            </w:r>
-            <w:r>
-              <w:rPr>
-                <w:rFonts w:ascii="BRH Malayalam Extra" w:hAnsi="BRH Malayalam Extra" w:cs="BRH Malayalam Extra"/>
-                <w:color w:val="000000"/>
-                <w:sz w:val="26"/>
-                <w:szCs w:val="32"/>
-                <w:highlight w:val="yellow"/>
-                <w:lang w:val="en-IN"/>
-              </w:rPr>
-              <w:t>–</w:t>
-            </w:r>
-            <w:r>
-              <w:rPr>
-                <w:rFonts w:ascii="BRH Malayalam Extra" w:hAnsi="BRH Malayalam Extra" w:cs="BRH Malayalam Extra"/>
-                <w:color w:val="000000"/>
-                <w:sz w:val="32"/>
-                <w:szCs w:val="32"/>
-                <w:highlight w:val="yellow"/>
-                <w:lang w:val="en-IN"/>
-              </w:rPr>
-              <w:t>Çx</w:t>
-            </w:r>
-            <w:r>
-              <w:rPr>
-                <w:rFonts w:ascii="BRH Malayalam Extra" w:hAnsi="BRH Malayalam Extra" w:cs="BRH Malayalam Extra"/>
-                <w:color w:val="000000"/>
-                <w:sz w:val="26"/>
-                <w:szCs w:val="32"/>
-                <w:highlight w:val="yellow"/>
-                <w:lang w:val="en-IN"/>
-              </w:rPr>
-              <w:t>–</w:t>
-            </w:r>
-            <w:r>
-              <w:rPr>
-                <w:rFonts w:ascii="BRH Malayalam Extra" w:hAnsi="BRH Malayalam Extra" w:cs="BRH Malayalam Extra"/>
-                <w:color w:val="000000"/>
-                <w:sz w:val="32"/>
-                <w:szCs w:val="32"/>
-                <w:highlight w:val="yellow"/>
-                <w:lang w:val="en-IN"/>
-              </w:rPr>
-              <w:t xml:space="preserve"> p</w:t>
-            </w:r>
-            <w:r>
-              <w:rPr>
-                <w:rFonts w:ascii="BRH Malayalam Extra" w:hAnsi="BRH Malayalam Extra" w:cs="BRH Malayalam Extra"/>
-                <w:color w:val="000000"/>
-                <w:sz w:val="26"/>
-                <w:szCs w:val="32"/>
-                <w:highlight w:val="yellow"/>
-                <w:lang w:val="en-IN"/>
-              </w:rPr>
-              <w:t>–</w:t>
-            </w:r>
-            <w:r>
-              <w:rPr>
-                <w:rFonts w:ascii="BRH Malayalam Extra" w:hAnsi="BRH Malayalam Extra" w:cs="BRH Malayalam Extra"/>
-                <w:color w:val="000000"/>
-                <w:sz w:val="32"/>
-                <w:szCs w:val="32"/>
-                <w:highlight w:val="yellow"/>
-                <w:lang w:val="en-IN"/>
-              </w:rPr>
-              <w:t>ªÆ</w:t>
-            </w:r>
-            <w:r>
-              <w:rPr>
-                <w:rFonts w:ascii="BRH Malayalam Extra" w:hAnsi="BRH Malayalam Extra" w:cs="BRH Malayalam Extra"/>
-                <w:color w:val="000000"/>
-                <w:sz w:val="26"/>
-                <w:szCs w:val="32"/>
-                <w:lang w:val="en-IN"/>
-              </w:rPr>
-              <w:t>–</w:t>
-            </w:r>
-            <w:r>
-              <w:rPr>
-                <w:rFonts w:ascii="BRH Malayalam Extra" w:hAnsi="BRH Malayalam Extra" w:cs="BRH Malayalam Extra"/>
-                <w:color w:val="000000"/>
-                <w:sz w:val="32"/>
-                <w:szCs w:val="32"/>
-                <w:lang w:val="en-IN"/>
-              </w:rPr>
-              <w:t>Ç</w:t>
-            </w:r>
-            <w:r>
-              <w:rPr>
-                <w:rFonts w:ascii="BRH Malayalam Extra" w:hAnsi="BRH Malayalam Extra" w:cs="BRH Malayalam Extra"/>
-                <w:color w:val="000000"/>
-                <w:sz w:val="26"/>
-                <w:szCs w:val="32"/>
-                <w:lang w:val="en-IN"/>
-              </w:rPr>
-              <w:t>–</w:t>
-            </w:r>
-            <w:r>
-              <w:rPr>
-                <w:rFonts w:ascii="BRH Malayalam Extra" w:hAnsi="BRH Malayalam Extra" w:cs="BRH Malayalam Extra"/>
-                <w:color w:val="000000"/>
-                <w:sz w:val="32"/>
-                <w:szCs w:val="32"/>
-                <w:lang w:val="en-IN"/>
-              </w:rPr>
-              <w:t xml:space="preserve"> </w:t>
-            </w:r>
-            <w:r>
-              <w:rPr>
-                <w:rFonts w:ascii="BRH Malayalam Extra" w:hAnsi="BRH Malayalam Extra" w:cs="BRH Malayalam Extra"/>
-                <w:color w:val="000000"/>
-                <w:sz w:val="32"/>
-                <w:szCs w:val="32"/>
-                <w:highlight w:val="yellow"/>
-                <w:lang w:val="en-IN"/>
-              </w:rPr>
-              <w:t>¥Z</w:t>
-            </w:r>
-            <w:r>
-              <w:rPr>
-                <w:rFonts w:ascii="BRH Malayalam Extra" w:hAnsi="BRH Malayalam Extra" w:cs="BRH Malayalam Extra"/>
-                <w:color w:val="000000"/>
-                <w:sz w:val="26"/>
-                <w:szCs w:val="32"/>
-                <w:highlight w:val="yellow"/>
-                <w:lang w:val="en-IN"/>
-              </w:rPr>
-              <w:t>–</w:t>
-            </w:r>
-            <w:r>
-              <w:rPr>
-                <w:rFonts w:ascii="BRH Malayalam Extra" w:hAnsi="BRH Malayalam Extra" w:cs="BRH Malayalam Extra"/>
-                <w:color w:val="000000"/>
-                <w:sz w:val="32"/>
-                <w:szCs w:val="32"/>
-                <w:highlight w:val="yellow"/>
-                <w:lang w:val="en-IN"/>
-              </w:rPr>
-              <w:t xml:space="preserve"> ¥Z</w:t>
-            </w:r>
-            <w:r>
-              <w:rPr>
-                <w:rFonts w:ascii="BRH Malayalam Extra" w:hAnsi="BRH Malayalam Extra" w:cs="BRH Malayalam Extra"/>
-                <w:color w:val="000000"/>
-                <w:sz w:val="26"/>
-                <w:szCs w:val="32"/>
-                <w:highlight w:val="yellow"/>
-                <w:lang w:val="en-IN"/>
-              </w:rPr>
-              <w:t>–</w:t>
-            </w:r>
-            <w:r>
-              <w:rPr>
-                <w:rFonts w:ascii="BRH Malayalam Extra" w:hAnsi="BRH Malayalam Extra" w:cs="BRH Malayalam Extra"/>
-                <w:color w:val="000000"/>
-                <w:sz w:val="32"/>
-                <w:szCs w:val="32"/>
-                <w:highlight w:val="yellow"/>
-                <w:lang w:val="en-IN"/>
-              </w:rPr>
-              <w:t xml:space="preserve"> „p</w:t>
-            </w:r>
-            <w:r>
-              <w:rPr>
-                <w:rFonts w:ascii="BRH Malayalam Extra" w:hAnsi="BRH Malayalam Extra" w:cs="BRH Malayalam Extra"/>
-                <w:color w:val="000000"/>
-                <w:sz w:val="26"/>
-                <w:szCs w:val="32"/>
-                <w:highlight w:val="yellow"/>
-                <w:lang w:val="en-IN"/>
-              </w:rPr>
-              <w:t>–</w:t>
-            </w:r>
-            <w:r>
-              <w:rPr>
-                <w:rFonts w:ascii="BRH Malayalam Extra" w:hAnsi="BRH Malayalam Extra" w:cs="BRH Malayalam Extra"/>
-                <w:color w:val="000000"/>
-                <w:sz w:val="32"/>
-                <w:szCs w:val="32"/>
-                <w:highlight w:val="yellow"/>
-                <w:lang w:val="en-IN"/>
-              </w:rPr>
-              <w:t>ªÆ</w:t>
-            </w:r>
-            <w:r>
-              <w:rPr>
-                <w:rFonts w:ascii="BRH Malayalam Extra" w:hAnsi="BRH Malayalam Extra" w:cs="BRH Malayalam Extra"/>
-                <w:color w:val="000000"/>
-                <w:sz w:val="26"/>
-                <w:szCs w:val="32"/>
-                <w:highlight w:val="yellow"/>
-                <w:lang w:val="en-IN"/>
-              </w:rPr>
-              <w:t>–</w:t>
-            </w:r>
-            <w:r>
-              <w:rPr>
-                <w:rFonts w:ascii="BRH Malayalam Extra" w:hAnsi="BRH Malayalam Extra" w:cs="BRH Malayalam Extra"/>
-                <w:color w:val="000000"/>
-                <w:sz w:val="32"/>
-                <w:szCs w:val="32"/>
-                <w:highlight w:val="yellow"/>
-                <w:lang w:val="en-IN"/>
-              </w:rPr>
-              <w:t>Ç</w:t>
-            </w:r>
-            <w:r>
-              <w:rPr>
-                <w:rFonts w:ascii="BRH Malayalam Extra" w:hAnsi="BRH Malayalam Extra" w:cs="BRH Malayalam Extra"/>
-                <w:color w:val="000000"/>
-                <w:sz w:val="26"/>
-                <w:szCs w:val="32"/>
-                <w:lang w:val="en-IN"/>
-              </w:rPr>
-              <w:t>–</w:t>
-            </w:r>
-            <w:r>
-              <w:rPr>
-                <w:rFonts w:ascii="BRH Malayalam Extra" w:hAnsi="BRH Malayalam Extra" w:cs="BRH Malayalam Extra"/>
-                <w:color w:val="000000"/>
-                <w:sz w:val="32"/>
-                <w:szCs w:val="32"/>
-                <w:lang w:val="en-IN"/>
-              </w:rPr>
-              <w:t xml:space="preserve"> | </w:t>
-            </w:r>
-          </w:p>
-          <w:p>
-            <w:pPr>
-              <w:widowControl w:val="0"/>
-              <w:autoSpaceDE w:val="0"/>
-              <w:autoSpaceDN w:val="0"/>
-              <w:adjustRightInd w:val="0"/>
-              <w:spacing w:before="0" w:line="240" w:lineRule="auto"/>
-              <w:rPr>
-                <w:rFonts w:cs="BRH Malayalam Extra"/>
                 <w:color w:val="FF0000"/>
                 <w:szCs w:val="40"/>
                 <w:lang w:val="en-IN"/>
               </w:rPr>
             </w:pPr>
+            <w:r>
+              <w:rPr>
+                <w:rFonts w:ascii="BRH Malayalam Extra" w:hAnsi="BRH Malayalam Extra" w:cs="BRH Malayalam Extra"/>
+                <w:color w:val="000000"/>
+                <w:sz w:val="32"/>
+                <w:szCs w:val="32"/>
+                <w:highlight w:val="yellow"/>
+                <w:lang w:val="en-IN"/>
+              </w:rPr>
+              <w:t>¥Z</w:t>
+            </w:r>
+            <w:r>
+              <w:rPr>
+                <w:rFonts w:ascii="BRH Malayalam Extra" w:hAnsi="BRH Malayalam Extra" w:cs="BRH Malayalam Extra"/>
+                <w:color w:val="000000"/>
+                <w:sz w:val="26"/>
+                <w:szCs w:val="32"/>
+                <w:lang w:val="en-IN"/>
+              </w:rPr>
+              <w:t>–</w:t>
+            </w:r>
+            <w:r>
+              <w:rPr>
+                <w:rFonts w:ascii="BRH Malayalam Extra" w:hAnsi="BRH Malayalam Extra" w:cs="BRH Malayalam Extra"/>
+                <w:color w:val="000000"/>
+                <w:sz w:val="32"/>
+                <w:szCs w:val="32"/>
+                <w:lang w:val="en-IN"/>
+              </w:rPr>
+              <w:t xml:space="preserve"> </w:t>
+            </w:r>
+            <w:r>
+              <w:rPr>
+                <w:rFonts w:ascii="BRH Malayalam Extra" w:hAnsi="BRH Malayalam Extra" w:cs="BRH Malayalam Extra"/>
+                <w:color w:val="000000"/>
+                <w:sz w:val="32"/>
+                <w:szCs w:val="32"/>
+                <w:highlight w:val="yellow"/>
+                <w:lang w:val="en-IN"/>
+              </w:rPr>
+              <w:t>„p</w:t>
+            </w:r>
+            <w:r>
+              <w:rPr>
+                <w:rFonts w:ascii="BRH Malayalam Extra" w:hAnsi="BRH Malayalam Extra" w:cs="BRH Malayalam Extra"/>
+                <w:color w:val="000000"/>
+                <w:sz w:val="26"/>
+                <w:szCs w:val="32"/>
+                <w:highlight w:val="yellow"/>
+                <w:lang w:val="en-IN"/>
+              </w:rPr>
+              <w:t>–</w:t>
+            </w:r>
+            <w:r>
+              <w:rPr>
+                <w:rFonts w:ascii="BRH Malayalam Extra" w:hAnsi="BRH Malayalam Extra" w:cs="BRH Malayalam Extra"/>
+                <w:color w:val="000000"/>
+                <w:sz w:val="32"/>
+                <w:szCs w:val="32"/>
+                <w:highlight w:val="yellow"/>
+                <w:lang w:val="en-IN"/>
+              </w:rPr>
+              <w:t>ªÆ</w:t>
+            </w:r>
+            <w:r>
+              <w:rPr>
+                <w:rFonts w:ascii="BRH Malayalam Extra" w:hAnsi="BRH Malayalam Extra" w:cs="BRH Malayalam Extra"/>
+                <w:color w:val="000000"/>
+                <w:sz w:val="26"/>
+                <w:szCs w:val="32"/>
+                <w:highlight w:val="yellow"/>
+                <w:lang w:val="en-IN"/>
+              </w:rPr>
+              <w:t>–</w:t>
+            </w:r>
+            <w:r>
+              <w:rPr>
+                <w:rFonts w:ascii="BRH Malayalam Extra" w:hAnsi="BRH Malayalam Extra" w:cs="BRH Malayalam Extra"/>
+                <w:color w:val="000000"/>
+                <w:sz w:val="32"/>
+                <w:szCs w:val="32"/>
+                <w:highlight w:val="yellow"/>
+                <w:lang w:val="en-IN"/>
+              </w:rPr>
+              <w:t>Çx</w:t>
+            </w:r>
+            <w:r>
+              <w:rPr>
+                <w:rFonts w:ascii="BRH Malayalam Extra" w:hAnsi="BRH Malayalam Extra" w:cs="BRH Malayalam Extra"/>
+                <w:color w:val="000000"/>
+                <w:sz w:val="26"/>
+                <w:szCs w:val="32"/>
+                <w:highlight w:val="yellow"/>
+                <w:lang w:val="en-IN"/>
+              </w:rPr>
+              <w:t>–</w:t>
+            </w:r>
+            <w:r>
+              <w:rPr>
+                <w:rFonts w:ascii="BRH Malayalam Extra" w:hAnsi="BRH Malayalam Extra" w:cs="BRH Malayalam Extra"/>
+                <w:color w:val="000000"/>
+                <w:sz w:val="32"/>
+                <w:szCs w:val="32"/>
+                <w:highlight w:val="yellow"/>
+                <w:lang w:val="en-IN"/>
+              </w:rPr>
+              <w:t xml:space="preserve"> p</w:t>
+            </w:r>
+            <w:r>
+              <w:rPr>
+                <w:rFonts w:ascii="BRH Malayalam Extra" w:hAnsi="BRH Malayalam Extra" w:cs="BRH Malayalam Extra"/>
+                <w:color w:val="000000"/>
+                <w:sz w:val="26"/>
+                <w:szCs w:val="32"/>
+                <w:highlight w:val="yellow"/>
+                <w:lang w:val="en-IN"/>
+              </w:rPr>
+              <w:t>–</w:t>
+            </w:r>
+            <w:r>
+              <w:rPr>
+                <w:rFonts w:ascii="BRH Malayalam Extra" w:hAnsi="BRH Malayalam Extra" w:cs="BRH Malayalam Extra"/>
+                <w:color w:val="000000"/>
+                <w:sz w:val="32"/>
+                <w:szCs w:val="32"/>
+                <w:highlight w:val="yellow"/>
+                <w:lang w:val="en-IN"/>
+              </w:rPr>
+              <w:t>ªÆ</w:t>
+            </w:r>
+            <w:r>
+              <w:rPr>
+                <w:rFonts w:ascii="BRH Malayalam Extra" w:hAnsi="BRH Malayalam Extra" w:cs="BRH Malayalam Extra"/>
+                <w:color w:val="000000"/>
+                <w:sz w:val="26"/>
+                <w:szCs w:val="32"/>
+                <w:lang w:val="en-IN"/>
+              </w:rPr>
+              <w:t>–</w:t>
+            </w:r>
+            <w:r>
+              <w:rPr>
+                <w:rFonts w:ascii="BRH Malayalam Extra" w:hAnsi="BRH Malayalam Extra" w:cs="BRH Malayalam Extra"/>
+                <w:color w:val="000000"/>
+                <w:sz w:val="32"/>
+                <w:szCs w:val="32"/>
+                <w:lang w:val="en-IN"/>
+              </w:rPr>
+              <w:t>Ç</w:t>
+            </w:r>
+            <w:r>
+              <w:rPr>
+                <w:rFonts w:ascii="BRH Malayalam Extra" w:hAnsi="BRH Malayalam Extra" w:cs="BRH Malayalam Extra"/>
+                <w:color w:val="000000"/>
+                <w:sz w:val="26"/>
+                <w:szCs w:val="32"/>
+                <w:lang w:val="en-IN"/>
+              </w:rPr>
+              <w:t>–</w:t>
+            </w:r>
+            <w:r>
+              <w:rPr>
+                <w:rFonts w:ascii="BRH Malayalam Extra" w:hAnsi="BRH Malayalam Extra" w:cs="BRH Malayalam Extra"/>
+                <w:color w:val="000000"/>
+                <w:sz w:val="32"/>
+                <w:szCs w:val="32"/>
+                <w:lang w:val="en-IN"/>
+              </w:rPr>
+              <w:t xml:space="preserve"> </w:t>
+            </w:r>
+            <w:r>
+              <w:rPr>
+                <w:rFonts w:ascii="BRH Malayalam Extra" w:hAnsi="BRH Malayalam Extra" w:cs="BRH Malayalam Extra"/>
+                <w:color w:val="000000"/>
+                <w:sz w:val="32"/>
+                <w:szCs w:val="32"/>
+                <w:highlight w:val="yellow"/>
+                <w:lang w:val="en-IN"/>
+              </w:rPr>
+              <w:t>¥Z</w:t>
+            </w:r>
+            <w:r>
+              <w:rPr>
+                <w:rFonts w:ascii="BRH Malayalam Extra" w:hAnsi="BRH Malayalam Extra" w:cs="BRH Malayalam Extra"/>
+                <w:color w:val="000000"/>
+                <w:sz w:val="26"/>
+                <w:szCs w:val="32"/>
+                <w:highlight w:val="yellow"/>
+                <w:lang w:val="en-IN"/>
+              </w:rPr>
+              <w:t>–</w:t>
+            </w:r>
+            <w:r>
+              <w:rPr>
+                <w:rFonts w:ascii="BRH Malayalam Extra" w:hAnsi="BRH Malayalam Extra" w:cs="BRH Malayalam Extra"/>
+                <w:color w:val="000000"/>
+                <w:sz w:val="32"/>
+                <w:szCs w:val="32"/>
+                <w:highlight w:val="yellow"/>
+                <w:lang w:val="en-IN"/>
+              </w:rPr>
+              <w:t xml:space="preserve"> ¥Z</w:t>
+            </w:r>
+            <w:r>
+              <w:rPr>
+                <w:rFonts w:ascii="BRH Malayalam Extra" w:hAnsi="BRH Malayalam Extra" w:cs="BRH Malayalam Extra"/>
+                <w:color w:val="000000"/>
+                <w:sz w:val="26"/>
+                <w:szCs w:val="32"/>
+                <w:highlight w:val="yellow"/>
+                <w:lang w:val="en-IN"/>
+              </w:rPr>
+              <w:t>–</w:t>
+            </w:r>
+            <w:r>
+              <w:rPr>
+                <w:rFonts w:ascii="BRH Malayalam Extra" w:hAnsi="BRH Malayalam Extra" w:cs="BRH Malayalam Extra"/>
+                <w:color w:val="000000"/>
+                <w:sz w:val="32"/>
+                <w:szCs w:val="32"/>
+                <w:highlight w:val="yellow"/>
+                <w:lang w:val="en-IN"/>
+              </w:rPr>
+              <w:t xml:space="preserve"> „p</w:t>
+            </w:r>
+            <w:r>
+              <w:rPr>
+                <w:rFonts w:ascii="BRH Malayalam Extra" w:hAnsi="BRH Malayalam Extra" w:cs="BRH Malayalam Extra"/>
+                <w:color w:val="000000"/>
+                <w:sz w:val="26"/>
+                <w:szCs w:val="32"/>
+                <w:highlight w:val="yellow"/>
+                <w:lang w:val="en-IN"/>
+              </w:rPr>
+              <w:t>–</w:t>
+            </w:r>
+            <w:r>
+              <w:rPr>
+                <w:rFonts w:ascii="BRH Malayalam Extra" w:hAnsi="BRH Malayalam Extra" w:cs="BRH Malayalam Extra"/>
+                <w:color w:val="000000"/>
+                <w:sz w:val="32"/>
+                <w:szCs w:val="32"/>
+                <w:highlight w:val="yellow"/>
+                <w:lang w:val="en-IN"/>
+              </w:rPr>
+              <w:t>ªÆ</w:t>
+            </w:r>
+            <w:r>
+              <w:rPr>
+                <w:rFonts w:ascii="BRH Malayalam Extra" w:hAnsi="BRH Malayalam Extra" w:cs="BRH Malayalam Extra"/>
+                <w:color w:val="000000"/>
+                <w:sz w:val="26"/>
+                <w:szCs w:val="32"/>
+                <w:highlight w:val="yellow"/>
+                <w:lang w:val="en-IN"/>
+              </w:rPr>
+              <w:t>–</w:t>
+            </w:r>
+            <w:r>
+              <w:rPr>
+                <w:rFonts w:ascii="BRH Malayalam Extra" w:hAnsi="BRH Malayalam Extra" w:cs="BRH Malayalam Extra"/>
+                <w:color w:val="000000"/>
+                <w:sz w:val="32"/>
+                <w:szCs w:val="32"/>
+                <w:highlight w:val="yellow"/>
+                <w:lang w:val="en-IN"/>
+              </w:rPr>
+              <w:t>Ç</w:t>
+            </w:r>
+            <w:r>
+              <w:rPr>
+                <w:rFonts w:ascii="BRH Malayalam Extra" w:hAnsi="BRH Malayalam Extra" w:cs="BRH Malayalam Extra"/>
+                <w:color w:val="000000"/>
+                <w:sz w:val="26"/>
+                <w:szCs w:val="32"/>
+                <w:lang w:val="en-IN"/>
+              </w:rPr>
+              <w:t>–</w:t>
+            </w:r>
+            <w:r>
+              <w:rPr>
+                <w:rFonts w:ascii="BRH Malayalam Extra" w:hAnsi="BRH Malayalam Extra" w:cs="BRH Malayalam Extra"/>
+                <w:color w:val="000000"/>
+                <w:sz w:val="32"/>
+                <w:szCs w:val="32"/>
+                <w:lang w:val="en-IN"/>
+              </w:rPr>
+              <w:t xml:space="preserve"> | </w:t>
+            </w:r>
           </w:p>
         </w:tc>
         <w:tc>
@@ -26983,12 +26887,238 @@
               <w:adjustRightInd w:val="0"/>
               <w:spacing w:before="0" w:line="240" w:lineRule="auto"/>
               <w:rPr>
-                <w:rFonts w:cs="BRH Malayalam Extra"/>
-                <w:color w:val="000000"/>
+                <w:rFonts w:ascii="BRH Malayalam Extra" w:hAnsi="BRH Malayalam Extra" w:cs="BRH Malayalam Extra"/>
+                <w:color w:val="000000"/>
+                <w:sz w:val="32"/>
                 <w:szCs w:val="32"/>
                 <w:lang w:val="en-IN"/>
               </w:rPr>
             </w:pPr>
+            <w:r>
+              <w:rPr>
+                <w:rFonts w:cs="BRH Malayalam Extra"/>
+                <w:color w:val="000000"/>
+                <w:szCs w:val="32"/>
+                <w:lang w:val="en-IN"/>
+              </w:rPr>
+              <w:t>20</w:t>
+            </w:r>
+            <w:r>
+              <w:rPr>
+                <w:rFonts w:ascii="BRH Malayalam Extra" w:hAnsi="BRH Malayalam Extra" w:cs="BRH Malayalam Extra"/>
+                <w:color w:val="000000"/>
+                <w:sz w:val="32"/>
+                <w:szCs w:val="32"/>
+                <w:lang w:val="en-IN"/>
+              </w:rPr>
+              <w:t>)</w:t>
+            </w:r>
+            <w:r>
+              <w:rPr>
+                <w:rFonts w:ascii="BRH Malayalam Extra" w:hAnsi="BRH Malayalam Extra" w:cs="BRH Malayalam Extra"/>
+                <w:color w:val="000000"/>
+                <w:sz w:val="32"/>
+                <w:szCs w:val="32"/>
+                <w:lang w:val="en-IN"/>
+              </w:rPr>
+              <w:tab/>
+            </w:r>
+            <w:r>
+              <w:rPr>
+                <w:rFonts w:cs="BRH Malayalam Extra"/>
+                <w:color w:val="000000"/>
+                <w:szCs w:val="32"/>
+                <w:lang w:val="en-IN"/>
+              </w:rPr>
+              <w:t>4</w:t>
+            </w:r>
+            <w:r>
+              <w:rPr>
+                <w:rFonts w:ascii="BRH Malayalam Extra" w:hAnsi="BRH Malayalam Extra" w:cs="BRH Malayalam Extra"/>
+                <w:color w:val="000000"/>
+                <w:sz w:val="32"/>
+                <w:szCs w:val="32"/>
+                <w:lang w:val="en-IN"/>
+              </w:rPr>
+              <w:t>.</w:t>
+            </w:r>
+            <w:r>
+              <w:rPr>
+                <w:rFonts w:cs="BRH Malayalam Extra"/>
+                <w:color w:val="000000"/>
+                <w:szCs w:val="32"/>
+                <w:lang w:val="en-IN"/>
+              </w:rPr>
+              <w:t>1</w:t>
+            </w:r>
+            <w:r>
+              <w:rPr>
+                <w:rFonts w:ascii="BRH Malayalam Extra" w:hAnsi="BRH Malayalam Extra" w:cs="BRH Malayalam Extra"/>
+                <w:color w:val="000000"/>
+                <w:sz w:val="32"/>
+                <w:szCs w:val="32"/>
+                <w:lang w:val="en-IN"/>
+              </w:rPr>
+              <w:t>.</w:t>
+            </w:r>
+            <w:r>
+              <w:rPr>
+                <w:rFonts w:cs="BRH Malayalam Extra"/>
+                <w:color w:val="000000"/>
+                <w:szCs w:val="32"/>
+                <w:lang w:val="en-IN"/>
+              </w:rPr>
+              <w:t>11</w:t>
+            </w:r>
+            <w:r>
+              <w:rPr>
+                <w:rFonts w:ascii="BRH Malayalam Extra" w:hAnsi="BRH Malayalam Extra" w:cs="BRH Malayalam Extra"/>
+                <w:color w:val="000000"/>
+                <w:sz w:val="32"/>
+                <w:szCs w:val="32"/>
+                <w:lang w:val="en-IN"/>
+              </w:rPr>
+              <w:t>.</w:t>
+            </w:r>
+            <w:r>
+              <w:rPr>
+                <w:rFonts w:cs="BRH Malayalam Extra"/>
+                <w:color w:val="000000"/>
+                <w:szCs w:val="32"/>
+                <w:lang w:val="en-IN"/>
+              </w:rPr>
+              <w:t>3</w:t>
+            </w:r>
+            <w:r>
+              <w:rPr>
+                <w:rFonts w:ascii="BRH Malayalam Extra" w:hAnsi="BRH Malayalam Extra" w:cs="BRH Malayalam Extra"/>
+                <w:color w:val="000000"/>
+                <w:sz w:val="32"/>
+                <w:szCs w:val="32"/>
+                <w:lang w:val="en-IN"/>
+              </w:rPr>
+              <w:t>(</w:t>
+            </w:r>
+            <w:r>
+              <w:rPr>
+                <w:rFonts w:cs="BRH Malayalam Extra"/>
+                <w:color w:val="000000"/>
+                <w:szCs w:val="32"/>
+                <w:lang w:val="en-IN"/>
+              </w:rPr>
+              <w:t>17</w:t>
+            </w:r>
+            <w:r>
+              <w:rPr>
+                <w:rFonts w:ascii="BRH Malayalam Extra" w:hAnsi="BRH Malayalam Extra" w:cs="BRH Malayalam Extra"/>
+                <w:color w:val="000000"/>
+                <w:sz w:val="32"/>
+                <w:szCs w:val="32"/>
+                <w:lang w:val="en-IN"/>
+              </w:rPr>
+              <w:t xml:space="preserve">)- </w:t>
+            </w:r>
+            <w:r>
+              <w:rPr>
+                <w:rFonts w:ascii="BRH Malayalam Extra" w:hAnsi="BRH Malayalam Extra" w:cs="BRH Malayalam Extra"/>
+                <w:color w:val="000000"/>
+                <w:sz w:val="32"/>
+                <w:szCs w:val="32"/>
+                <w:highlight w:val="green"/>
+                <w:lang w:val="en-IN"/>
+              </w:rPr>
+              <w:t>¥Z</w:t>
+            </w:r>
+            <w:r>
+              <w:rPr>
+                <w:rFonts w:ascii="BRH Malayalam Extra" w:hAnsi="BRH Malayalam Extra" w:cs="BRH Malayalam Extra"/>
+                <w:color w:val="000000"/>
+                <w:sz w:val="32"/>
+                <w:szCs w:val="32"/>
+                <w:lang w:val="en-IN"/>
+              </w:rPr>
+              <w:t xml:space="preserve"> | A</w:t>
+            </w:r>
+            <w:r>
+              <w:rPr>
+                <w:rFonts w:ascii="BRH Malayalam Extra" w:hAnsi="BRH Malayalam Extra" w:cs="BRH Malayalam Extra"/>
+                <w:color w:val="000000"/>
+                <w:sz w:val="26"/>
+                <w:szCs w:val="32"/>
+                <w:lang w:val="en-IN"/>
+              </w:rPr>
+              <w:t>–</w:t>
+            </w:r>
+            <w:r>
+              <w:rPr>
+                <w:rFonts w:ascii="BRH Malayalam Extra" w:hAnsi="BRH Malayalam Extra" w:cs="BRH Malayalam Extra"/>
+                <w:color w:val="000000"/>
+                <w:sz w:val="32"/>
+                <w:szCs w:val="32"/>
+                <w:lang w:val="en-IN"/>
+              </w:rPr>
+              <w:t>p</w:t>
+            </w:r>
+            <w:r>
+              <w:rPr>
+                <w:rFonts w:ascii="BRH Malayalam Extra" w:hAnsi="BRH Malayalam Extra" w:cs="BRH Malayalam Extra"/>
+                <w:color w:val="000000"/>
+                <w:sz w:val="26"/>
+                <w:szCs w:val="32"/>
+                <w:lang w:val="en-IN"/>
+              </w:rPr>
+              <w:t>–</w:t>
+            </w:r>
+            <w:r>
+              <w:rPr>
+                <w:rFonts w:ascii="BRH Malayalam Extra" w:hAnsi="BRH Malayalam Extra" w:cs="BRH Malayalam Extra"/>
+                <w:color w:val="000000"/>
+                <w:sz w:val="32"/>
+                <w:szCs w:val="32"/>
+                <w:lang w:val="en-IN"/>
+              </w:rPr>
+              <w:t>ªÆ</w:t>
+            </w:r>
+            <w:r>
+              <w:rPr>
+                <w:rFonts w:ascii="BRH Malayalam Extra" w:hAnsi="BRH Malayalam Extra" w:cs="BRH Malayalam Extra"/>
+                <w:color w:val="000000"/>
+                <w:sz w:val="26"/>
+                <w:szCs w:val="32"/>
+                <w:lang w:val="en-IN"/>
+              </w:rPr>
+              <w:t>–</w:t>
+            </w:r>
+            <w:r>
+              <w:rPr>
+                <w:rFonts w:ascii="BRH Malayalam Extra" w:hAnsi="BRH Malayalam Extra" w:cs="BRH Malayalam Extra"/>
+                <w:color w:val="000000"/>
+                <w:sz w:val="32"/>
+                <w:szCs w:val="32"/>
+                <w:lang w:val="en-IN"/>
+              </w:rPr>
+              <w:t>Ç</w:t>
+            </w:r>
+            <w:r>
+              <w:rPr>
+                <w:rFonts w:ascii="BRH Malayalam Extra" w:hAnsi="BRH Malayalam Extra" w:cs="BRH Malayalam Extra"/>
+                <w:color w:val="000000"/>
+                <w:sz w:val="26"/>
+                <w:szCs w:val="32"/>
+                <w:lang w:val="en-IN"/>
+              </w:rPr>
+              <w:t>–</w:t>
+            </w:r>
+            <w:r>
+              <w:rPr>
+                <w:rFonts w:ascii="BRH Malayalam Extra" w:hAnsi="BRH Malayalam Extra" w:cs="BRH Malayalam Extra"/>
+                <w:color w:val="000000"/>
+                <w:sz w:val="32"/>
+                <w:szCs w:val="32"/>
+                <w:lang w:val="en-IN"/>
+              </w:rPr>
+              <w:t xml:space="preserve"> | </w:t>
+            </w:r>
           </w:p>
           <w:p>
             <w:pPr>
@@ -26999,456 +27129,140 @@
               <w:spacing w:before="0" w:line="240" w:lineRule="auto"/>
               <w:rPr>
                 <w:rFonts w:cs="BRH Malayalam Extra"/>
-                <w:color w:val="000000"/>
-                <w:szCs w:val="32"/>
-                <w:lang w:val="en-IN"/>
-              </w:rPr>
-            </w:pPr>
-          </w:p>
-          <w:p>
-            <w:pPr>
-              <w:widowControl w:val="0"/>
-              <w:autoSpaceDE w:val="0"/>
-              <w:autoSpaceDN w:val="0"/>
-              <w:adjustRightInd w:val="0"/>
-              <w:spacing w:before="0" w:line="240" w:lineRule="auto"/>
-              <w:rPr>
-                <w:rFonts w:cs="BRH Malayalam Extra"/>
-                <w:color w:val="000000"/>
-                <w:szCs w:val="32"/>
-                <w:lang w:val="en-IN"/>
-              </w:rPr>
-            </w:pPr>
-          </w:p>
-          <w:p>
-            <w:pPr>
-              <w:widowControl w:val="0"/>
-              <w:autoSpaceDE w:val="0"/>
-              <w:autoSpaceDN w:val="0"/>
-              <w:adjustRightInd w:val="0"/>
-              <w:spacing w:before="0" w:line="240" w:lineRule="auto"/>
-              <w:rPr>
-                <w:rFonts w:cs="BRH Malayalam Extra"/>
-                <w:color w:val="000000"/>
-                <w:szCs w:val="32"/>
-                <w:lang w:val="en-IN"/>
-              </w:rPr>
-            </w:pPr>
-          </w:p>
-          <w:p>
-            <w:pPr>
-              <w:widowControl w:val="0"/>
-              <w:autoSpaceDE w:val="0"/>
-              <w:autoSpaceDN w:val="0"/>
-              <w:adjustRightInd w:val="0"/>
-              <w:spacing w:before="0" w:line="240" w:lineRule="auto"/>
-              <w:rPr>
-                <w:rFonts w:ascii="BRH Malayalam Extra" w:hAnsi="BRH Malayalam Extra" w:cs="BRH Malayalam Extra"/>
-                <w:color w:val="000000"/>
-                <w:sz w:val="32"/>
-                <w:szCs w:val="32"/>
-                <w:lang w:val="en-IN"/>
-              </w:rPr>
-            </w:pPr>
-            <w:r>
-              <w:rPr>
-                <w:rFonts w:cs="BRH Malayalam Extra"/>
-                <w:color w:val="000000"/>
-                <w:szCs w:val="32"/>
-                <w:lang w:val="en-IN"/>
-              </w:rPr>
-              <w:t>20</w:t>
-            </w:r>
-            <w:r>
-              <w:rPr>
-                <w:rFonts w:ascii="BRH Malayalam Extra" w:hAnsi="BRH Malayalam Extra" w:cs="BRH Malayalam Extra"/>
-                <w:color w:val="000000"/>
-                <w:sz w:val="32"/>
-                <w:szCs w:val="32"/>
-                <w:lang w:val="en-IN"/>
-              </w:rPr>
-              <w:t>)</w:t>
-            </w:r>
-            <w:r>
-              <w:rPr>
-                <w:rFonts w:ascii="BRH Malayalam Extra" w:hAnsi="BRH Malayalam Extra" w:cs="BRH Malayalam Extra"/>
-                <w:color w:val="000000"/>
-                <w:sz w:val="32"/>
-                <w:szCs w:val="32"/>
-                <w:lang w:val="en-IN"/>
-              </w:rPr>
-              <w:tab/>
-            </w:r>
-            <w:r>
-              <w:rPr>
-                <w:rFonts w:cs="BRH Malayalam Extra"/>
-                <w:color w:val="000000"/>
-                <w:szCs w:val="32"/>
-                <w:lang w:val="en-IN"/>
-              </w:rPr>
-              <w:t>4</w:t>
-            </w:r>
-            <w:r>
-              <w:rPr>
-                <w:rFonts w:ascii="BRH Malayalam Extra" w:hAnsi="BRH Malayalam Extra" w:cs="BRH Malayalam Extra"/>
-                <w:color w:val="000000"/>
-                <w:sz w:val="32"/>
-                <w:szCs w:val="32"/>
-                <w:lang w:val="en-IN"/>
-              </w:rPr>
-              <w:t>.</w:t>
-            </w:r>
-            <w:r>
-              <w:rPr>
-                <w:rFonts w:cs="BRH Malayalam Extra"/>
-                <w:color w:val="000000"/>
-                <w:szCs w:val="32"/>
-                <w:lang w:val="en-IN"/>
-              </w:rPr>
-              <w:t>1</w:t>
-            </w:r>
-            <w:r>
-              <w:rPr>
-                <w:rFonts w:ascii="BRH Malayalam Extra" w:hAnsi="BRH Malayalam Extra" w:cs="BRH Malayalam Extra"/>
-                <w:color w:val="000000"/>
-                <w:sz w:val="32"/>
-                <w:szCs w:val="32"/>
-                <w:lang w:val="en-IN"/>
-              </w:rPr>
-              <w:t>.</w:t>
-            </w:r>
-            <w:r>
-              <w:rPr>
-                <w:rFonts w:cs="BRH Malayalam Extra"/>
-                <w:color w:val="000000"/>
-                <w:szCs w:val="32"/>
-                <w:lang w:val="en-IN"/>
-              </w:rPr>
-              <w:t>11</w:t>
-            </w:r>
-            <w:r>
-              <w:rPr>
-                <w:rFonts w:ascii="BRH Malayalam Extra" w:hAnsi="BRH Malayalam Extra" w:cs="BRH Malayalam Extra"/>
-                <w:color w:val="000000"/>
-                <w:sz w:val="32"/>
-                <w:szCs w:val="32"/>
-                <w:lang w:val="en-IN"/>
-              </w:rPr>
-              <w:t>.</w:t>
-            </w:r>
-            <w:r>
-              <w:rPr>
-                <w:rFonts w:cs="BRH Malayalam Extra"/>
-                <w:color w:val="000000"/>
-                <w:szCs w:val="32"/>
-                <w:lang w:val="en-IN"/>
-              </w:rPr>
-              <w:t>3</w:t>
-            </w:r>
-            <w:r>
-              <w:rPr>
-                <w:rFonts w:ascii="BRH Malayalam Extra" w:hAnsi="BRH Malayalam Extra" w:cs="BRH Malayalam Extra"/>
-                <w:color w:val="000000"/>
-                <w:sz w:val="32"/>
-                <w:szCs w:val="32"/>
-                <w:lang w:val="en-IN"/>
-              </w:rPr>
-              <w:t>(</w:t>
-            </w:r>
-            <w:r>
-              <w:rPr>
-                <w:rFonts w:cs="BRH Malayalam Extra"/>
-                <w:color w:val="000000"/>
-                <w:szCs w:val="32"/>
-                <w:lang w:val="en-IN"/>
-              </w:rPr>
-              <w:t>17</w:t>
-            </w:r>
-            <w:r>
-              <w:rPr>
-                <w:rFonts w:ascii="BRH Malayalam Extra" w:hAnsi="BRH Malayalam Extra" w:cs="BRH Malayalam Extra"/>
-                <w:color w:val="000000"/>
-                <w:sz w:val="32"/>
-                <w:szCs w:val="32"/>
-                <w:lang w:val="en-IN"/>
-              </w:rPr>
-              <w:t xml:space="preserve">)- </w:t>
-            </w:r>
-            <w:r>
-              <w:rPr>
-                <w:rFonts w:ascii="BRH Malayalam Extra" w:hAnsi="BRH Malayalam Extra" w:cs="BRH Malayalam Extra"/>
-                <w:color w:val="000000"/>
-                <w:sz w:val="32"/>
-                <w:szCs w:val="32"/>
-                <w:highlight w:val="green"/>
-                <w:lang w:val="en-IN"/>
-              </w:rPr>
-              <w:t>¥Z</w:t>
-            </w:r>
-            <w:r>
-              <w:rPr>
-                <w:rFonts w:ascii="BRH Malayalam Extra" w:hAnsi="BRH Malayalam Extra" w:cs="BRH Malayalam Extra"/>
-                <w:color w:val="000000"/>
-                <w:sz w:val="32"/>
-                <w:szCs w:val="32"/>
-                <w:lang w:val="en-IN"/>
-              </w:rPr>
-              <w:t xml:space="preserve"> | A</w:t>
-            </w:r>
-            <w:r>
-              <w:rPr>
-                <w:rFonts w:ascii="BRH Malayalam Extra" w:hAnsi="BRH Malayalam Extra" w:cs="BRH Malayalam Extra"/>
-                <w:color w:val="000000"/>
-                <w:sz w:val="26"/>
-                <w:szCs w:val="32"/>
-                <w:lang w:val="en-IN"/>
-              </w:rPr>
-              <w:t>–</w:t>
-            </w:r>
-            <w:r>
-              <w:rPr>
-                <w:rFonts w:ascii="BRH Malayalam Extra" w:hAnsi="BRH Malayalam Extra" w:cs="BRH Malayalam Extra"/>
-                <w:color w:val="000000"/>
-                <w:sz w:val="32"/>
-                <w:szCs w:val="32"/>
-                <w:lang w:val="en-IN"/>
-              </w:rPr>
-              <w:t>p</w:t>
-            </w:r>
-            <w:r>
-              <w:rPr>
-                <w:rFonts w:ascii="BRH Malayalam Extra" w:hAnsi="BRH Malayalam Extra" w:cs="BRH Malayalam Extra"/>
-                <w:color w:val="000000"/>
-                <w:sz w:val="26"/>
-                <w:szCs w:val="32"/>
-                <w:lang w:val="en-IN"/>
-              </w:rPr>
-              <w:t>–</w:t>
-            </w:r>
-            <w:r>
-              <w:rPr>
-                <w:rFonts w:ascii="BRH Malayalam Extra" w:hAnsi="BRH Malayalam Extra" w:cs="BRH Malayalam Extra"/>
-                <w:color w:val="000000"/>
-                <w:sz w:val="32"/>
-                <w:szCs w:val="32"/>
-                <w:lang w:val="en-IN"/>
-              </w:rPr>
-              <w:t>ªÆ</w:t>
-            </w:r>
-            <w:r>
-              <w:rPr>
-                <w:rFonts w:ascii="BRH Malayalam Extra" w:hAnsi="BRH Malayalam Extra" w:cs="BRH Malayalam Extra"/>
-                <w:color w:val="000000"/>
-                <w:sz w:val="26"/>
-                <w:szCs w:val="32"/>
-                <w:lang w:val="en-IN"/>
-              </w:rPr>
-              <w:t>–</w:t>
-            </w:r>
-            <w:r>
-              <w:rPr>
-                <w:rFonts w:ascii="BRH Malayalam Extra" w:hAnsi="BRH Malayalam Extra" w:cs="BRH Malayalam Extra"/>
-                <w:color w:val="000000"/>
-                <w:sz w:val="32"/>
-                <w:szCs w:val="32"/>
-                <w:lang w:val="en-IN"/>
-              </w:rPr>
-              <w:t>Ç</w:t>
-            </w:r>
-            <w:r>
-              <w:rPr>
-                <w:rFonts w:ascii="BRH Malayalam Extra" w:hAnsi="BRH Malayalam Extra" w:cs="BRH Malayalam Extra"/>
-                <w:color w:val="000000"/>
-                <w:sz w:val="26"/>
-                <w:szCs w:val="32"/>
-                <w:lang w:val="en-IN"/>
-              </w:rPr>
-              <w:t>–</w:t>
-            </w:r>
-            <w:r>
-              <w:rPr>
-                <w:rFonts w:ascii="BRH Malayalam Extra" w:hAnsi="BRH Malayalam Extra" w:cs="BRH Malayalam Extra"/>
-                <w:color w:val="000000"/>
-                <w:sz w:val="32"/>
-                <w:szCs w:val="32"/>
-                <w:lang w:val="en-IN"/>
-              </w:rPr>
-              <w:t xml:space="preserve"> | </w:t>
-            </w:r>
-          </w:p>
-          <w:p>
-            <w:pPr>
-              <w:widowControl w:val="0"/>
-              <w:autoSpaceDE w:val="0"/>
-              <w:autoSpaceDN w:val="0"/>
-              <w:adjustRightInd w:val="0"/>
-              <w:spacing w:before="0" w:line="240" w:lineRule="auto"/>
-              <w:rPr>
-                <w:rFonts w:ascii="BRH Malayalam Extra" w:hAnsi="BRH Malayalam Extra" w:cs="BRH Malayalam Extra"/>
-                <w:color w:val="000000"/>
-                <w:sz w:val="32"/>
-                <w:szCs w:val="32"/>
-                <w:lang w:val="en-IN"/>
-              </w:rPr>
-            </w:pPr>
-            <w:r>
-              <w:rPr>
-                <w:rFonts w:ascii="BRH Malayalam Extra" w:hAnsi="BRH Malayalam Extra" w:cs="BRH Malayalam Extra"/>
-                <w:color w:val="000000"/>
-                <w:sz w:val="32"/>
-                <w:szCs w:val="32"/>
-                <w:highlight w:val="green"/>
-                <w:lang w:val="en-IN"/>
-              </w:rPr>
-              <w:t>¥Z—</w:t>
-            </w:r>
-            <w:r>
-              <w:rPr>
-                <w:rFonts w:ascii="BRH Malayalam Extra" w:hAnsi="BRH Malayalam Extra" w:cs="BRH Malayalam Extra"/>
-                <w:color w:val="000000"/>
-                <w:sz w:val="32"/>
-                <w:szCs w:val="32"/>
-                <w:lang w:val="en-IN"/>
-              </w:rPr>
-              <w:t xml:space="preserve"> </w:t>
-            </w:r>
-            <w:r>
-              <w:rPr>
-                <w:rFonts w:ascii="BRH Malayalam Extra" w:hAnsi="BRH Malayalam Extra" w:cs="BRH Malayalam Extra"/>
-                <w:color w:val="000000"/>
-                <w:sz w:val="32"/>
-                <w:szCs w:val="32"/>
-                <w:highlight w:val="green"/>
-                <w:lang w:val="en-IN"/>
-              </w:rPr>
-              <w:t>„pªÆÇx pªÆ</w:t>
-            </w:r>
-            <w:r>
-              <w:rPr>
-                <w:rFonts w:ascii="BRH Malayalam Extra" w:hAnsi="BRH Malayalam Extra" w:cs="BRH Malayalam Extra"/>
-                <w:color w:val="000000"/>
-                <w:sz w:val="32"/>
-                <w:szCs w:val="32"/>
-                <w:lang w:val="en-IN"/>
-              </w:rPr>
-              <w:t>Ç</w:t>
-            </w:r>
-            <w:r>
-              <w:rPr>
-                <w:rFonts w:ascii="BRH Malayalam Extra" w:hAnsi="BRH Malayalam Extra" w:cs="BRH Malayalam Extra"/>
-                <w:color w:val="000000"/>
-                <w:sz w:val="26"/>
-                <w:szCs w:val="32"/>
-                <w:lang w:val="en-IN"/>
-              </w:rPr>
-              <w:t>–</w:t>
-            </w:r>
-            <w:r>
-              <w:rPr>
-                <w:rFonts w:ascii="BRH Malayalam Extra" w:hAnsi="BRH Malayalam Extra" w:cs="BRH Malayalam Extra"/>
-                <w:color w:val="000000"/>
-                <w:sz w:val="32"/>
-                <w:szCs w:val="32"/>
-                <w:lang w:val="en-IN"/>
-              </w:rPr>
-              <w:t xml:space="preserve"> </w:t>
-            </w:r>
-            <w:r>
-              <w:rPr>
-                <w:rFonts w:ascii="BRH Malayalam Extra" w:hAnsi="BRH Malayalam Extra" w:cs="BRH Malayalam Extra"/>
-                <w:color w:val="000000"/>
-                <w:sz w:val="32"/>
-                <w:szCs w:val="32"/>
-                <w:highlight w:val="green"/>
-                <w:lang w:val="en-IN"/>
-              </w:rPr>
-              <w:t>¥Z</w:t>
-            </w:r>
-            <w:r>
-              <w:rPr>
-                <w:rFonts w:ascii="BRH Malayalam Extra" w:hAnsi="BRH Malayalam Extra" w:cs="BRH Malayalam Extra"/>
-                <w:color w:val="000000"/>
-                <w:sz w:val="32"/>
-                <w:szCs w:val="32"/>
-                <w:lang w:val="en-IN"/>
-              </w:rPr>
-              <w:t xml:space="preserve"> </w:t>
-            </w:r>
-            <w:r>
-              <w:rPr>
-                <w:rFonts w:ascii="BRH Malayalam Extra" w:hAnsi="BRH Malayalam Extra" w:cs="BRH Malayalam Extra"/>
-                <w:color w:val="000000"/>
-                <w:sz w:val="32"/>
-                <w:szCs w:val="32"/>
-                <w:highlight w:val="green"/>
-                <w:lang w:val="en-IN"/>
-              </w:rPr>
-              <w:t>¥Z</w:t>
-            </w:r>
-            <w:r>
-              <w:rPr>
-                <w:rFonts w:ascii="BRH Malayalam Extra" w:hAnsi="BRH Malayalam Extra" w:cs="BRH Malayalam Extra"/>
-                <w:color w:val="000000"/>
-                <w:sz w:val="32"/>
-                <w:szCs w:val="32"/>
-                <w:lang w:val="en-IN"/>
-              </w:rPr>
-              <w:t xml:space="preserve">— </w:t>
-            </w:r>
-            <w:r>
-              <w:rPr>
-                <w:rFonts w:ascii="BRH Malayalam Extra" w:hAnsi="BRH Malayalam Extra" w:cs="BRH Malayalam Extra"/>
-                <w:color w:val="000000"/>
-                <w:sz w:val="32"/>
-                <w:szCs w:val="32"/>
-                <w:highlight w:val="green"/>
-                <w:lang w:val="en-IN"/>
-              </w:rPr>
-              <w:t>„pªÆÇ</w:t>
-            </w:r>
-            <w:r>
-              <w:rPr>
-                <w:rFonts w:ascii="BRH Malayalam Extra" w:hAnsi="BRH Malayalam Extra" w:cs="BRH Malayalam Extra"/>
-                <w:color w:val="000000"/>
-                <w:sz w:val="32"/>
-                <w:szCs w:val="32"/>
-                <w:lang w:val="en-IN"/>
-              </w:rPr>
-              <w:t xml:space="preserve"> | </w:t>
-            </w:r>
-          </w:p>
-          <w:p>
-            <w:pPr>
-              <w:widowControl w:val="0"/>
-              <w:autoSpaceDE w:val="0"/>
-              <w:autoSpaceDN w:val="0"/>
-              <w:adjustRightInd w:val="0"/>
-              <w:spacing w:before="0" w:line="240" w:lineRule="auto"/>
-              <w:rPr>
-                <w:rFonts w:cs="BRH Malayalam Extra"/>
                 <w:color w:val="FF0000"/>
                 <w:szCs w:val="40"/>
                 <w:lang w:val="en-IN"/>
               </w:rPr>
             </w:pPr>
+            <w:r>
+              <w:rPr>
+                <w:rFonts w:ascii="BRH Malayalam Extra" w:hAnsi="BRH Malayalam Extra" w:cs="BRH Malayalam Extra"/>
+                <w:color w:val="000000"/>
+                <w:sz w:val="32"/>
+                <w:szCs w:val="32"/>
+                <w:highlight w:val="green"/>
+                <w:lang w:val="en-IN"/>
+              </w:rPr>
+              <w:t>¥Z—</w:t>
+            </w:r>
+            <w:r>
+              <w:rPr>
+                <w:rFonts w:ascii="BRH Malayalam Extra" w:hAnsi="BRH Malayalam Extra" w:cs="BRH Malayalam Extra"/>
+                <w:color w:val="000000"/>
+                <w:sz w:val="32"/>
+                <w:szCs w:val="32"/>
+                <w:lang w:val="en-IN"/>
+              </w:rPr>
+              <w:t xml:space="preserve"> </w:t>
+            </w:r>
+            <w:r>
+              <w:rPr>
+                <w:rFonts w:ascii="BRH Malayalam Extra" w:hAnsi="BRH Malayalam Extra" w:cs="BRH Malayalam Extra"/>
+                <w:color w:val="000000"/>
+                <w:sz w:val="32"/>
+                <w:szCs w:val="32"/>
+                <w:highlight w:val="green"/>
+                <w:lang w:val="en-IN"/>
+              </w:rPr>
+              <w:t>„pªÆÇx pªÆ</w:t>
+            </w:r>
+            <w:r>
+              <w:rPr>
+                <w:rFonts w:ascii="BRH Malayalam Extra" w:hAnsi="BRH Malayalam Extra" w:cs="BRH Malayalam Extra"/>
+                <w:color w:val="000000"/>
+                <w:sz w:val="32"/>
+                <w:szCs w:val="32"/>
+                <w:lang w:val="en-IN"/>
+              </w:rPr>
+              <w:t>Ç</w:t>
+            </w:r>
+            <w:r>
+              <w:rPr>
+                <w:rFonts w:ascii="BRH Malayalam Extra" w:hAnsi="BRH Malayalam Extra" w:cs="BRH Malayalam Extra"/>
+                <w:color w:val="000000"/>
+                <w:sz w:val="26"/>
+                <w:szCs w:val="32"/>
+                <w:lang w:val="en-IN"/>
+              </w:rPr>
+              <w:t>–</w:t>
+            </w:r>
+            <w:r>
+              <w:rPr>
+                <w:rFonts w:ascii="BRH Malayalam Extra" w:hAnsi="BRH Malayalam Extra" w:cs="BRH Malayalam Extra"/>
+                <w:color w:val="000000"/>
+                <w:sz w:val="32"/>
+                <w:szCs w:val="32"/>
+                <w:lang w:val="en-IN"/>
+              </w:rPr>
+              <w:t xml:space="preserve"> </w:t>
+            </w:r>
+            <w:r>
+              <w:rPr>
+                <w:rFonts w:ascii="BRH Malayalam Extra" w:hAnsi="BRH Malayalam Extra" w:cs="BRH Malayalam Extra"/>
+                <w:color w:val="000000"/>
+                <w:sz w:val="32"/>
+                <w:szCs w:val="32"/>
+                <w:highlight w:val="green"/>
+                <w:lang w:val="en-IN"/>
+              </w:rPr>
+              <w:t>¥Z</w:t>
+            </w:r>
+            <w:r>
+              <w:rPr>
+                <w:rFonts w:ascii="BRH Malayalam Extra" w:hAnsi="BRH Malayalam Extra" w:cs="BRH Malayalam Extra"/>
+                <w:color w:val="000000"/>
+                <w:sz w:val="32"/>
+                <w:szCs w:val="32"/>
+                <w:lang w:val="en-IN"/>
+              </w:rPr>
+              <w:t xml:space="preserve"> </w:t>
+            </w:r>
+            <w:r>
+              <w:rPr>
+                <w:rFonts w:ascii="BRH Malayalam Extra" w:hAnsi="BRH Malayalam Extra" w:cs="BRH Malayalam Extra"/>
+                <w:color w:val="000000"/>
+                <w:sz w:val="32"/>
+                <w:szCs w:val="32"/>
+                <w:highlight w:val="green"/>
+                <w:lang w:val="en-IN"/>
+              </w:rPr>
+              <w:t>¥Z</w:t>
+            </w:r>
+            <w:r>
+              <w:rPr>
+                <w:rFonts w:ascii="BRH Malayalam Extra" w:hAnsi="BRH Malayalam Extra" w:cs="BRH Malayalam Extra"/>
+                <w:color w:val="000000"/>
+                <w:sz w:val="32"/>
+                <w:szCs w:val="32"/>
+                <w:lang w:val="en-IN"/>
+              </w:rPr>
+              <w:t xml:space="preserve">— </w:t>
+            </w:r>
+            <w:r>
+              <w:rPr>
+                <w:rFonts w:ascii="BRH Malayalam Extra" w:hAnsi="BRH Malayalam Extra" w:cs="BRH Malayalam Extra"/>
+                <w:color w:val="000000"/>
+                <w:sz w:val="32"/>
+                <w:szCs w:val="32"/>
+                <w:highlight w:val="green"/>
+                <w:lang w:val="en-IN"/>
+              </w:rPr>
+              <w:t>„pªÆÇ</w:t>
+            </w:r>
+            <w:r>
+              <w:rPr>
+                <w:rFonts w:ascii="BRH Malayalam Extra" w:hAnsi="BRH Malayalam Extra" w:cs="BRH Malayalam Extra"/>
+                <w:color w:val="000000"/>
+                <w:sz w:val="32"/>
+                <w:szCs w:val="32"/>
+                <w:lang w:val="en-IN"/>
+              </w:rPr>
+              <w:t xml:space="preserve"> | </w:t>
+            </w:r>
           </w:p>
         </w:tc>
       </w:tr>
     </w:tbl>
-    <w:p>
-      <w:pPr>
-        <w:spacing w:before="0" w:line="240" w:lineRule="auto"/>
-        <w:jc w:val="center"/>
-        <w:rPr>
-          <w:b/>
-          <w:bCs/>
-          <w:sz w:val="32"/>
-          <w:szCs w:val="32"/>
-          <w:u w:val="single"/>
-          <w:lang w:val="en-IN"/>
-        </w:rPr>
-      </w:pPr>
-    </w:p>
     <w:p>
       <w:pPr>
         <w:spacing w:before="0" w:line="240" w:lineRule="auto"/>
@@ -27497,32 +27311,6 @@
           <w:u w:val="single"/>
         </w:rPr>
       </w:pPr>
-    </w:p>
-    <w:p>
-      <w:pPr>
-        <w:spacing w:before="0" w:line="240" w:lineRule="auto"/>
-        <w:jc w:val="center"/>
-        <w:rPr>
-          <w:b/>
-          <w:bCs/>
-          <w:sz w:val="32"/>
-          <w:szCs w:val="32"/>
-          <w:u w:val="single"/>
-        </w:rPr>
-      </w:pPr>
-    </w:p>
-    <w:p>
-      <w:pPr>
-        <w:spacing w:before="0" w:line="240" w:lineRule="auto"/>
-        <w:jc w:val="center"/>
-        <w:rPr>
-          <w:b/>
-          <w:bCs/>
-          <w:sz w:val="32"/>
-          <w:szCs w:val="32"/>
-          <w:u w:val="single"/>
-        </w:rPr>
-      </w:pPr>
       <w:r>
         <w:rPr>
           <w:b/>
@@ -27531,6 +27319,7 @@
           <w:szCs w:val="32"/>
           <w:u w:val="single"/>
         </w:rPr>
+        <w:lastRenderedPageBreak/>
         <w:t xml:space="preserve">TS </w:t>
       </w:r>
       <w:r>

</xml_diff>